<commit_message>
New safe pont yeah
</commit_message>
<xml_diff>
--- a/НИРС2/НИРС2.docx
+++ b/НИРС2/НИРС2.docx
@@ -680,11 +680,9 @@
             <w:r>
               <w:t xml:space="preserve">. </w:t>
             </w:r>
-            <w:proofErr w:type="spellStart"/>
             <w:r>
               <w:t>Шаболин</w:t>
             </w:r>
-            <w:proofErr w:type="spellEnd"/>
           </w:p>
         </w:tc>
       </w:tr>
@@ -6451,13 +6449,8 @@
         <w:pStyle w:val="a1"/>
       </w:pPr>
       <w:r>
-        <w:t xml:space="preserve">WLTC </w:t>
-      </w:r>
-      <w:proofErr w:type="spellStart"/>
-      <w:r>
-        <w:t>Low</w:t>
-      </w:r>
-      <w:proofErr w:type="spellEnd"/>
+        <w:t>WLTC Low</w:t>
+      </w:r>
       <w:r>
         <w:t xml:space="preserve"> </w:t>
       </w:r>
@@ -6677,13 +6670,8 @@
         </w:numPr>
       </w:pPr>
       <w:r>
-        <w:t xml:space="preserve">WLTC (все фазы </w:t>
-      </w:r>
-      <w:proofErr w:type="spellStart"/>
-      <w:r>
-        <w:t>Low</w:t>
-      </w:r>
-      <w:proofErr w:type="spellEnd"/>
+        <w:t>WLTC (все фазы Low</w:t>
+      </w:r>
       <w:r>
         <w:t xml:space="preserve"> </w:t>
       </w:r>
@@ -6845,15 +6833,7 @@
       </w:r>
       <w:proofErr w:type="spellEnd"/>
       <w:r>
-        <w:t xml:space="preserve"> Test </w:t>
-      </w:r>
-      <w:proofErr w:type="spellStart"/>
-      <w:r>
-        <w:t>Cycle</w:t>
-      </w:r>
-      <w:proofErr w:type="spellEnd"/>
-      <w:r>
-        <w:t>) класса 3 (для автомобилей с максимальной скоростью &gt;120 км/ч). Выбор обосновывается следующими факторами</w:t>
+        <w:t xml:space="preserve"> Test Cycle) класса 3 (для автомобилей с максимальной скоростью &gt;120 км/ч). Выбор обосновывается следующими факторами</w:t>
       </w:r>
       <w:r>
         <w:t xml:space="preserve"> </w:t>
@@ -10975,7 +10955,7 @@
           <w:rFonts w:eastAsiaTheme="minorEastAsia"/>
           <w:szCs w:val="24"/>
         </w:rPr>
-        <w:t>;</w:t>
+        <w:t>.</w:t>
       </w:r>
     </w:p>
     <w:p>
@@ -13079,15 +13059,7 @@
     </w:p>
     <w:p>
       <w:r>
-        <w:t xml:space="preserve">Расход топлива составил 5,36 л/100 км в городском цикле (WLTC </w:t>
-      </w:r>
-      <w:proofErr w:type="spellStart"/>
-      <w:r>
-        <w:t>Low</w:t>
-      </w:r>
-      <w:proofErr w:type="spellEnd"/>
-      <w:r>
-        <w:t xml:space="preserve">) и 6,39 л/100 км на шоссе (WLTC </w:t>
+        <w:t xml:space="preserve">Расход топлива составил 5,36 л/100 км в городском цикле (WLTC Low) и 6,39 л/100 км на шоссе (WLTC </w:t>
       </w:r>
       <w:r>
         <w:rPr>
@@ -15637,6 +15609,9 @@
     <w:p>
       <w:pPr>
         <w:ind w:firstLine="0"/>
+        <w:rPr>
+          <w:lang w:val="en-US"/>
+        </w:rPr>
       </w:pPr>
       <w:r>
         <w:rPr>
@@ -15645,6 +15620,9 @@
         <w:t>mg</w:t>
       </w:r>
       <w:r>
+        <w:rPr>
+          <w:lang w:val="en-US"/>
+        </w:rPr>
         <w:t xml:space="preserve"> = </w:t>
       </w:r>
       <w:proofErr w:type="gramStart"/>
@@ -15655,17 +15633,27 @@
         <w:t>struct</w:t>
       </w:r>
       <w:r>
+        <w:rPr>
+          <w:lang w:val="en-US"/>
+        </w:rPr>
         <w:t>(</w:t>
       </w:r>
       <w:proofErr w:type="gramEnd"/>
       <w:r>
+        <w:rPr>
+          <w:lang w:val="en-US"/>
+        </w:rPr>
         <w:t>);</w:t>
       </w:r>
     </w:p>
     <w:p>
       <w:pPr>
         <w:ind w:firstLine="0"/>
-      </w:pPr>
+        <w:rPr>
+          <w:lang w:val="en-US"/>
+        </w:rPr>
+      </w:pPr>
+      <w:proofErr w:type="spellStart"/>
       <w:proofErr w:type="gramStart"/>
       <w:r>
         <w:rPr>
@@ -15674,6 +15662,9 @@
         <w:t>mg</w:t>
       </w:r>
       <w:r>
+        <w:rPr>
+          <w:lang w:val="en-US"/>
+        </w:rPr>
         <w:t>.</w:t>
       </w:r>
       <w:r>
@@ -15684,6 +15675,9 @@
       </w:r>
       <w:proofErr w:type="gramEnd"/>
       <w:r>
+        <w:rPr>
+          <w:lang w:val="en-US"/>
+        </w:rPr>
         <w:t>_</w:t>
       </w:r>
       <w:r>
@@ -15693,6 +15687,9 @@
         <w:t>mg</w:t>
       </w:r>
       <w:r>
+        <w:rPr>
+          <w:lang w:val="en-US"/>
+        </w:rPr>
         <w:t>_</w:t>
       </w:r>
       <w:r>
@@ -15701,15 +15698,25 @@
         </w:rPr>
         <w:t>max</w:t>
       </w:r>
-      <w:r>
+      <w:proofErr w:type="spellEnd"/>
+      <w:r>
+        <w:rPr>
+          <w:lang w:val="en-US"/>
+        </w:rPr>
         <w:t xml:space="preserve"> = </w:t>
       </w:r>
       <w:proofErr w:type="gramStart"/>
       <w:r>
+        <w:rPr>
+          <w:lang w:val="en-US"/>
+        </w:rPr>
         <w:t xml:space="preserve">15;   </w:t>
       </w:r>
       <w:proofErr w:type="gramEnd"/>
       <w:r>
+        <w:rPr>
+          <w:lang w:val="en-US"/>
+        </w:rPr>
         <w:t xml:space="preserve">     % </w:t>
       </w:r>
       <w:r>
@@ -16231,64 +16238,73 @@
     <w:p>
       <w:pPr>
         <w:ind w:firstLine="0"/>
-        <w:rPr>
-          <w:lang w:val="en-US"/>
-        </w:rPr>
-      </w:pPr>
-      <w:r>
-        <w:rPr>
-          <w:lang w:val="en-US"/>
-        </w:rPr>
-        <w:t>dt = [0; diff(t)];</w:t>
-      </w:r>
-    </w:p>
-    <w:p>
-      <w:pPr>
-        <w:ind w:firstLine="0"/>
-        <w:rPr>
-          <w:lang w:val="en-US"/>
-        </w:rPr>
-      </w:pPr>
-    </w:p>
-    <w:p>
-      <w:pPr>
-        <w:ind w:firstLine="0"/>
-        <w:rPr>
-          <w:lang w:val="en-US"/>
-        </w:rPr>
-      </w:pPr>
-      <w:r>
-        <w:rPr>
-          <w:lang w:val="en-US"/>
-        </w:rPr>
+      </w:pPr>
+      <w:r>
+        <w:rPr>
+          <w:lang w:val="en-US"/>
+        </w:rPr>
+        <w:t>dt</w:t>
+      </w:r>
+      <w:r>
+        <w:t xml:space="preserve"> = [0; </w:t>
+      </w:r>
+      <w:r>
+        <w:rPr>
+          <w:lang w:val="en-US"/>
+        </w:rPr>
+        <w:t>diff</w:t>
+      </w:r>
+      <w:r>
+        <w:t>(</w:t>
+      </w:r>
+      <w:r>
+        <w:rPr>
+          <w:lang w:val="en-US"/>
+        </w:rPr>
+        <w:t>t</w:t>
+      </w:r>
+      <w:r>
+        <w:t>)];</w:t>
+      </w:r>
+    </w:p>
+    <w:p>
+      <w:pPr>
+        <w:ind w:firstLine="0"/>
+      </w:pPr>
+    </w:p>
+    <w:p>
+      <w:pPr>
+        <w:ind w:firstLine="0"/>
+      </w:pPr>
+      <w:r>
         <w:t xml:space="preserve">%% ========== </w:t>
       </w:r>
       <w:r>
         <w:t>Сетка</w:t>
       </w:r>
       <w:r>
-        <w:rPr>
-          <w:lang w:val="en-US"/>
-        </w:rPr>
         <w:t xml:space="preserve"> </w:t>
       </w:r>
       <w:r>
         <w:t>передаточных</w:t>
       </w:r>
       <w:r>
-        <w:rPr>
-          <w:lang w:val="en-US"/>
-        </w:rPr>
         <w:t xml:space="preserve"> </w:t>
       </w:r>
       <w:r>
         <w:t>чисел</w:t>
       </w:r>
       <w:r>
-        <w:rPr>
-          <w:lang w:val="en-US"/>
-        </w:rPr>
-        <w:t xml:space="preserve"> CVT ==========</w:t>
+        <w:t xml:space="preserve"> </w:t>
+      </w:r>
+      <w:r>
+        <w:rPr>
+          <w:lang w:val="en-US"/>
+        </w:rPr>
+        <w:t>CVT</w:t>
+      </w:r>
+      <w:r>
+        <w:t xml:space="preserve"> ==========</w:t>
       </w:r>
     </w:p>
     <w:p>
@@ -17329,6 +17345,9 @@
     <w:p>
       <w:pPr>
         <w:ind w:firstLine="0"/>
+        <w:rPr>
+          <w:lang w:val="en-US"/>
+        </w:rPr>
       </w:pPr>
       <w:r>
         <w:rPr>
@@ -17343,6 +17362,9 @@
         <w:t>ek</w:t>
       </w:r>
       <w:r>
+        <w:rPr>
+          <w:lang w:val="en-US"/>
+        </w:rPr>
         <w:t xml:space="preserve"> = </w:t>
       </w:r>
       <w:proofErr w:type="spellStart"/>
@@ -17354,8 +17376,12 @@
       </w:r>
       <w:proofErr w:type="spellEnd"/>
       <w:r>
+        <w:rPr>
+          <w:lang w:val="en-US"/>
+        </w:rPr>
         <w:t xml:space="preserve"> / </w:t>
       </w:r>
+      <w:proofErr w:type="spellStart"/>
       <w:proofErr w:type="gramStart"/>
       <w:r>
         <w:rPr>
@@ -17364,6 +17390,9 @@
         <w:t>vehicle</w:t>
       </w:r>
       <w:r>
+        <w:rPr>
+          <w:lang w:val="en-US"/>
+        </w:rPr>
         <w:t>.</w:t>
       </w:r>
       <w:r>
@@ -17372,16 +17401,26 @@
         </w:rPr>
         <w:t>r</w:t>
       </w:r>
+      <w:proofErr w:type="spellEnd"/>
       <w:proofErr w:type="gramEnd"/>
       <w:r>
+        <w:rPr>
+          <w:lang w:val="en-US"/>
+        </w:rPr>
         <w:t>;</w:t>
       </w:r>
     </w:p>
     <w:p>
       <w:pPr>
         <w:ind w:firstLine="0"/>
-      </w:pPr>
-      <w:r>
+        <w:rPr>
+          <w:lang w:val="en-US"/>
+        </w:rPr>
+      </w:pPr>
+      <w:r>
+        <w:rPr>
+          <w:lang w:val="en-US"/>
+        </w:rPr>
         <w:t xml:space="preserve">    </w:t>
       </w:r>
     </w:p>
@@ -17390,6 +17429,9 @@
         <w:ind w:firstLine="0"/>
       </w:pPr>
       <w:r>
+        <w:rPr>
+          <w:lang w:val="en-US"/>
+        </w:rPr>
         <w:lastRenderedPageBreak/>
         <w:t xml:space="preserve">    </w:t>
       </w:r>
@@ -18847,10 +18889,14 @@
     <w:p>
       <w:pPr>
         <w:ind w:firstLine="0"/>
+        <w:rPr>
+          <w:lang w:val="en-US"/>
+        </w:rPr>
       </w:pPr>
       <w:r>
         <w:t xml:space="preserve">            </w:t>
       </w:r>
+      <w:proofErr w:type="spellStart"/>
       <w:r>
         <w:rPr>
           <w:lang w:val="en-US"/>
@@ -18858,6 +18904,9 @@
         <w:t>T</w:t>
       </w:r>
       <w:r>
+        <w:rPr>
+          <w:lang w:val="en-US"/>
+        </w:rPr>
         <w:t>_</w:t>
       </w:r>
       <w:r>
@@ -18867,6 +18916,9 @@
         <w:t>mg</w:t>
       </w:r>
       <w:r>
+        <w:rPr>
+          <w:lang w:val="en-US"/>
+        </w:rPr>
         <w:t>_</w:t>
       </w:r>
       <w:r>
@@ -18876,6 +18928,9 @@
         <w:t>max</w:t>
       </w:r>
       <w:r>
+        <w:rPr>
+          <w:lang w:val="en-US"/>
+        </w:rPr>
         <w:t>_</w:t>
       </w:r>
       <w:r>
@@ -18884,9 +18939,14 @@
         </w:rPr>
         <w:t>gen</w:t>
       </w:r>
-      <w:r>
+      <w:proofErr w:type="spellEnd"/>
+      <w:r>
+        <w:rPr>
+          <w:lang w:val="en-US"/>
+        </w:rPr>
         <w:t xml:space="preserve"> = -</w:t>
       </w:r>
+      <w:proofErr w:type="spellStart"/>
       <w:proofErr w:type="gramStart"/>
       <w:r>
         <w:rPr>
@@ -18895,6 +18955,9 @@
         <w:t>mg</w:t>
       </w:r>
       <w:r>
+        <w:rPr>
+          <w:lang w:val="en-US"/>
+        </w:rPr>
         <w:t>.</w:t>
       </w:r>
       <w:r>
@@ -18905,6 +18968,9 @@
       </w:r>
       <w:proofErr w:type="gramEnd"/>
       <w:r>
+        <w:rPr>
+          <w:lang w:val="en-US"/>
+        </w:rPr>
         <w:t>_</w:t>
       </w:r>
       <w:r>
@@ -18914,9 +18980,11 @@
         <w:t>max</w:t>
       </w:r>
       <w:r>
+        <w:rPr>
+          <w:lang w:val="en-US"/>
+        </w:rPr>
         <w:t>_</w:t>
       </w:r>
-      <w:proofErr w:type="spellStart"/>
       <w:r>
         <w:rPr>
           <w:lang w:val="en-US"/>
@@ -18925,8 +18993,12 @@
       </w:r>
       <w:proofErr w:type="spellEnd"/>
       <w:r>
+        <w:rPr>
+          <w:lang w:val="en-US"/>
+        </w:rPr>
         <w:t>(</w:t>
       </w:r>
+      <w:proofErr w:type="spellStart"/>
       <w:r>
         <w:rPr>
           <w:lang w:val="en-US"/>
@@ -18934,9 +19006,11 @@
         <w:t>w</w:t>
       </w:r>
       <w:r>
+        <w:rPr>
+          <w:lang w:val="en-US"/>
+        </w:rPr>
         <w:t>_</w:t>
       </w:r>
-      <w:proofErr w:type="spellStart"/>
       <w:r>
         <w:rPr>
           <w:lang w:val="en-US"/>
@@ -18945,6 +19019,9 @@
       </w:r>
       <w:proofErr w:type="spellEnd"/>
       <w:r>
+        <w:rPr>
+          <w:lang w:val="en-US"/>
+        </w:rPr>
         <w:t>);</w:t>
       </w:r>
     </w:p>
@@ -18956,13 +19033,30 @@
         </w:rPr>
       </w:pPr>
       <w:r>
+        <w:rPr>
+          <w:lang w:val="en-US"/>
+        </w:rPr>
         <w:t xml:space="preserve">            </w:t>
       </w:r>
       <w:r>
         <w:rPr>
           <w:lang w:val="en-US"/>
         </w:rPr>
-        <w:t xml:space="preserve">if T_mg_req &lt; </w:t>
+        <w:t xml:space="preserve">if </w:t>
+      </w:r>
+      <w:proofErr w:type="spellStart"/>
+      <w:r>
+        <w:rPr>
+          <w:lang w:val="en-US"/>
+        </w:rPr>
+        <w:t>T_mg_req</w:t>
+      </w:r>
+      <w:proofErr w:type="spellEnd"/>
+      <w:r>
+        <w:rPr>
+          <w:lang w:val="en-US"/>
+        </w:rPr>
+        <w:t xml:space="preserve"> &lt; </w:t>
       </w:r>
       <w:proofErr w:type="spellStart"/>
       <w:r>
@@ -19130,10 +19224,14 @@
     <w:p>
       <w:pPr>
         <w:ind w:firstLine="0"/>
+        <w:rPr>
+          <w:lang w:val="en-US"/>
+        </w:rPr>
       </w:pPr>
       <w:r>
         <w:t xml:space="preserve">            </w:t>
       </w:r>
+      <w:proofErr w:type="spellStart"/>
       <w:r>
         <w:rPr>
           <w:lang w:val="en-US"/>
@@ -19141,6 +19239,9 @@
         <w:t>P</w:t>
       </w:r>
       <w:r>
+        <w:rPr>
+          <w:lang w:val="en-US"/>
+        </w:rPr>
         <w:t>_</w:t>
       </w:r>
       <w:r>
@@ -19150,6 +19251,9 @@
         <w:t>mg</w:t>
       </w:r>
       <w:r>
+        <w:rPr>
+          <w:lang w:val="en-US"/>
+        </w:rPr>
         <w:t>_</w:t>
       </w:r>
       <w:r>
@@ -19158,9 +19262,14 @@
         </w:rPr>
         <w:t>mech</w:t>
       </w:r>
-      <w:r>
+      <w:proofErr w:type="spellEnd"/>
+      <w:r>
+        <w:rPr>
+          <w:lang w:val="en-US"/>
+        </w:rPr>
         <w:t xml:space="preserve"> = </w:t>
       </w:r>
+      <w:proofErr w:type="spellStart"/>
       <w:r>
         <w:rPr>
           <w:lang w:val="en-US"/>
@@ -19168,6 +19277,9 @@
         <w:t>T</w:t>
       </w:r>
       <w:r>
+        <w:rPr>
+          <w:lang w:val="en-US"/>
+        </w:rPr>
         <w:t>_</w:t>
       </w:r>
       <w:r>
@@ -19177,6 +19289,9 @@
         <w:t>mg</w:t>
       </w:r>
       <w:r>
+        <w:rPr>
+          <w:lang w:val="en-US"/>
+        </w:rPr>
         <w:t>_</w:t>
       </w:r>
       <w:r>
@@ -19185,9 +19300,14 @@
         </w:rPr>
         <w:t>req</w:t>
       </w:r>
-      <w:r>
+      <w:proofErr w:type="spellEnd"/>
+      <w:r>
+        <w:rPr>
+          <w:lang w:val="en-US"/>
+        </w:rPr>
         <w:t xml:space="preserve"> * </w:t>
       </w:r>
+      <w:proofErr w:type="spellStart"/>
       <w:r>
         <w:rPr>
           <w:lang w:val="en-US"/>
@@ -19195,9 +19315,11 @@
         <w:t>w</w:t>
       </w:r>
       <w:r>
+        <w:rPr>
+          <w:lang w:val="en-US"/>
+        </w:rPr>
         <w:t>_</w:t>
       </w:r>
-      <w:proofErr w:type="spellStart"/>
       <w:r>
         <w:rPr>
           <w:lang w:val="en-US"/>
@@ -19206,26 +19328,43 @@
       </w:r>
       <w:proofErr w:type="spellEnd"/>
       <w:r>
+        <w:rPr>
+          <w:lang w:val="en-US"/>
+        </w:rPr>
         <w:t xml:space="preserve"> / </w:t>
       </w:r>
       <w:proofErr w:type="gramStart"/>
       <w:r>
+        <w:rPr>
+          <w:lang w:val="en-US"/>
+        </w:rPr>
         <w:t xml:space="preserve">1000;   </w:t>
       </w:r>
       <w:proofErr w:type="gramEnd"/>
       <w:r>
+        <w:rPr>
+          <w:lang w:val="en-US"/>
+        </w:rPr>
         <w:t xml:space="preserve">% </w:t>
       </w:r>
       <w:r>
         <w:t>кВт</w:t>
       </w:r>
       <w:r>
+        <w:rPr>
+          <w:lang w:val="en-US"/>
+        </w:rPr>
         <w:t xml:space="preserve"> (</w:t>
       </w:r>
+      <w:proofErr w:type="spellStart"/>
       <w:r>
         <w:t>отриц</w:t>
       </w:r>
-      <w:r>
+      <w:proofErr w:type="spellEnd"/>
+      <w:r>
+        <w:rPr>
+          <w:lang w:val="en-US"/>
+        </w:rPr>
         <w:t>.)</w:t>
       </w:r>
     </w:p>
@@ -19234,6 +19373,9 @@
         <w:ind w:firstLine="0"/>
       </w:pPr>
       <w:r>
+        <w:rPr>
+          <w:lang w:val="en-US"/>
+        </w:rPr>
         <w:t xml:space="preserve">            </w:t>
       </w:r>
       <w:r>
@@ -20250,14 +20392,10 @@
     <w:p>
       <w:pPr>
         <w:ind w:firstLine="0"/>
-        <w:rPr>
-          <w:lang w:val="en-US"/>
-        </w:rPr>
       </w:pPr>
       <w:r>
         <w:t xml:space="preserve">    </w:t>
       </w:r>
-      <w:proofErr w:type="spellStart"/>
       <w:r>
         <w:rPr>
           <w:lang w:val="en-US"/>
@@ -20265,9 +20403,6 @@
         <w:t>T</w:t>
       </w:r>
       <w:r>
-        <w:rPr>
-          <w:lang w:val="en-US"/>
-        </w:rPr>
         <w:t>_</w:t>
       </w:r>
       <w:r>
@@ -20276,14 +20411,9 @@
         </w:rPr>
         <w:t>wheel</w:t>
       </w:r>
-      <w:proofErr w:type="spellEnd"/>
-      <w:r>
-        <w:rPr>
-          <w:lang w:val="en-US"/>
-        </w:rPr>
+      <w:r>
         <w:t xml:space="preserve"> = </w:t>
       </w:r>
-      <w:proofErr w:type="spellStart"/>
       <w:r>
         <w:rPr>
           <w:lang w:val="en-US"/>
@@ -20291,9 +20421,6 @@
         <w:t>F</w:t>
       </w:r>
       <w:r>
-        <w:rPr>
-          <w:lang w:val="en-US"/>
-        </w:rPr>
         <w:t>_</w:t>
       </w:r>
       <w:r>
@@ -20302,14 +20429,9 @@
         </w:rPr>
         <w:t>total</w:t>
       </w:r>
-      <w:proofErr w:type="spellEnd"/>
-      <w:r>
-        <w:rPr>
-          <w:lang w:val="en-US"/>
-        </w:rPr>
+      <w:r>
         <w:t xml:space="preserve"> * </w:t>
       </w:r>
-      <w:proofErr w:type="spellStart"/>
       <w:proofErr w:type="gramStart"/>
       <w:r>
         <w:rPr>
@@ -20318,9 +20440,6 @@
         <w:t>vehicle</w:t>
       </w:r>
       <w:r>
-        <w:rPr>
-          <w:lang w:val="en-US"/>
-        </w:rPr>
         <w:t>.</w:t>
       </w:r>
       <w:r>
@@ -20329,15 +20448,10 @@
         </w:rPr>
         <w:t>r</w:t>
       </w:r>
-      <w:proofErr w:type="spellEnd"/>
       <w:proofErr w:type="gramEnd"/>
       <w:r>
-        <w:rPr>
-          <w:lang w:val="en-US"/>
-        </w:rPr>
         <w:t xml:space="preserve"> + </w:t>
       </w:r>
-      <w:proofErr w:type="spellStart"/>
       <w:proofErr w:type="gramStart"/>
       <w:r>
         <w:rPr>
@@ -20346,9 +20460,6 @@
         <w:t>vehicle</w:t>
       </w:r>
       <w:r>
-        <w:rPr>
-          <w:lang w:val="en-US"/>
-        </w:rPr>
         <w:t>.</w:t>
       </w:r>
       <w:r>
@@ -20359,9 +20470,6 @@
       </w:r>
       <w:proofErr w:type="gramEnd"/>
       <w:r>
-        <w:rPr>
-          <w:lang w:val="en-US"/>
-        </w:rPr>
         <w:t>_</w:t>
       </w:r>
       <w:r>
@@ -20370,11 +20478,7 @@
         </w:rPr>
         <w:t>w</w:t>
       </w:r>
-      <w:proofErr w:type="spellEnd"/>
-      <w:r>
-        <w:rPr>
-          <w:lang w:val="en-US"/>
-        </w:rPr>
+      <w:r>
         <w:t xml:space="preserve"> * </w:t>
       </w:r>
       <w:r>
@@ -20384,23 +20488,14 @@
         <w:t>ek</w:t>
       </w:r>
       <w:r>
-        <w:rPr>
-          <w:lang w:val="en-US"/>
-        </w:rPr>
         <w:t>;</w:t>
       </w:r>
     </w:p>
     <w:p>
       <w:pPr>
         <w:ind w:firstLine="0"/>
-        <w:rPr>
-          <w:lang w:val="en-US"/>
-        </w:rPr>
-      </w:pPr>
-      <w:r>
-        <w:rPr>
-          <w:lang w:val="en-US"/>
-        </w:rPr>
+      </w:pPr>
+      <w:r>
         <w:t xml:space="preserve">    </w:t>
       </w:r>
     </w:p>
@@ -20412,9 +20507,6 @@
         </w:rPr>
       </w:pPr>
       <w:r>
-        <w:rPr>
-          <w:lang w:val="en-US"/>
-        </w:rPr>
         <w:t xml:space="preserve">    </w:t>
       </w:r>
       <w:proofErr w:type="spellStart"/>
@@ -22066,10 +22158,14 @@
     <w:p>
       <w:pPr>
         <w:ind w:firstLine="0"/>
+        <w:rPr>
+          <w:lang w:val="en-US"/>
+        </w:rPr>
       </w:pPr>
       <w:r>
         <w:t xml:space="preserve">            </w:t>
       </w:r>
+      <w:proofErr w:type="spellStart"/>
       <w:r>
         <w:rPr>
           <w:lang w:val="en-US"/>
@@ -22077,6 +22173,9 @@
         <w:t>P</w:t>
       </w:r>
       <w:r>
+        <w:rPr>
+          <w:lang w:val="en-US"/>
+        </w:rPr>
         <w:t>_</w:t>
       </w:r>
       <w:r>
@@ -22086,6 +22185,9 @@
         <w:t>mg</w:t>
       </w:r>
       <w:r>
+        <w:rPr>
+          <w:lang w:val="en-US"/>
+        </w:rPr>
         <w:t>_</w:t>
       </w:r>
       <w:r>
@@ -22094,9 +22196,14 @@
         </w:rPr>
         <w:t>mech</w:t>
       </w:r>
-      <w:r>
+      <w:proofErr w:type="spellEnd"/>
+      <w:r>
+        <w:rPr>
+          <w:lang w:val="en-US"/>
+        </w:rPr>
         <w:t xml:space="preserve"> = </w:t>
       </w:r>
+      <w:proofErr w:type="spellStart"/>
       <w:r>
         <w:rPr>
           <w:lang w:val="en-US"/>
@@ -22104,6 +22211,9 @@
         <w:t>T</w:t>
       </w:r>
       <w:r>
+        <w:rPr>
+          <w:lang w:val="en-US"/>
+        </w:rPr>
         <w:t>_</w:t>
       </w:r>
       <w:r>
@@ -22112,9 +22222,14 @@
         </w:rPr>
         <w:t>mg</w:t>
       </w:r>
-      <w:r>
+      <w:proofErr w:type="spellEnd"/>
+      <w:r>
+        <w:rPr>
+          <w:lang w:val="en-US"/>
+        </w:rPr>
         <w:t xml:space="preserve"> * </w:t>
       </w:r>
+      <w:proofErr w:type="spellStart"/>
       <w:r>
         <w:rPr>
           <w:lang w:val="en-US"/>
@@ -22122,9 +22237,11 @@
         <w:t>w</w:t>
       </w:r>
       <w:r>
+        <w:rPr>
+          <w:lang w:val="en-US"/>
+        </w:rPr>
         <w:t>_</w:t>
       </w:r>
-      <w:proofErr w:type="spellStart"/>
       <w:r>
         <w:rPr>
           <w:lang w:val="en-US"/>
@@ -22133,14 +22250,23 @@
       </w:r>
       <w:proofErr w:type="spellEnd"/>
       <w:r>
+        <w:rPr>
+          <w:lang w:val="en-US"/>
+        </w:rPr>
         <w:t xml:space="preserve"> / </w:t>
       </w:r>
       <w:proofErr w:type="gramStart"/>
       <w:r>
+        <w:rPr>
+          <w:lang w:val="en-US"/>
+        </w:rPr>
         <w:t xml:space="preserve">1000;   </w:t>
       </w:r>
       <w:proofErr w:type="gramEnd"/>
       <w:r>
+        <w:rPr>
+          <w:lang w:val="en-US"/>
+        </w:rPr>
         <w:t xml:space="preserve">% </w:t>
       </w:r>
       <w:r>
@@ -22152,6 +22278,9 @@
         <w:ind w:firstLine="0"/>
       </w:pPr>
       <w:r>
+        <w:rPr>
+          <w:lang w:val="en-US"/>
+        </w:rPr>
         <w:t xml:space="preserve">            </w:t>
       </w:r>
       <w:proofErr w:type="spellStart"/>
@@ -22607,14 +22736,134 @@
         <w:rPr>
           <w:lang w:val="en-US"/>
         </w:rPr>
-        <w:t xml:space="preserve"> * </w:t>
-      </w:r>
-      <w:proofErr w:type="spellStart"/>
-      <w:r>
-        <w:rPr>
-          <w:lang w:val="en-US"/>
-        </w:rPr>
-        <w:t>P_batt</w:t>
+        <w:t xml:space="preserve"> * P_batt;</w:t>
+      </w:r>
+    </w:p>
+    <w:p>
+      <w:pPr>
+        <w:ind w:firstLine="0"/>
+        <w:rPr>
+          <w:lang w:val="en-US"/>
+        </w:rPr>
+      </w:pPr>
+      <w:r>
+        <w:rPr>
+          <w:lang w:val="en-US"/>
+        </w:rPr>
+        <w:t xml:space="preserve">            </w:t>
+      </w:r>
+    </w:p>
+    <w:p>
+      <w:pPr>
+        <w:ind w:firstLine="0"/>
+        <w:rPr>
+          <w:lang w:val="en-US"/>
+        </w:rPr>
+      </w:pPr>
+      <w:r>
+        <w:rPr>
+          <w:lang w:val="en-US"/>
+        </w:rPr>
+        <w:t xml:space="preserve">            if J &lt; </w:t>
+      </w:r>
+      <w:proofErr w:type="spellStart"/>
+      <w:r>
+        <w:rPr>
+          <w:lang w:val="en-US"/>
+        </w:rPr>
+        <w:t>best_J</w:t>
+      </w:r>
+      <w:proofErr w:type="spellEnd"/>
+    </w:p>
+    <w:p>
+      <w:pPr>
+        <w:ind w:firstLine="0"/>
+        <w:rPr>
+          <w:lang w:val="en-US"/>
+        </w:rPr>
+      </w:pPr>
+      <w:r>
+        <w:rPr>
+          <w:lang w:val="en-US"/>
+        </w:rPr>
+        <w:t xml:space="preserve">                </w:t>
+      </w:r>
+      <w:proofErr w:type="spellStart"/>
+      <w:r>
+        <w:rPr>
+          <w:lang w:val="en-US"/>
+        </w:rPr>
+        <w:t>best_J</w:t>
+      </w:r>
+      <w:proofErr w:type="spellEnd"/>
+      <w:r>
+        <w:rPr>
+          <w:lang w:val="en-US"/>
+        </w:rPr>
+        <w:t xml:space="preserve"> = J;</w:t>
+      </w:r>
+    </w:p>
+    <w:p>
+      <w:pPr>
+        <w:ind w:firstLine="0"/>
+        <w:rPr>
+          <w:lang w:val="en-US"/>
+        </w:rPr>
+      </w:pPr>
+      <w:r>
+        <w:rPr>
+          <w:lang w:val="en-US"/>
+        </w:rPr>
+        <w:t xml:space="preserve">                </w:t>
+      </w:r>
+      <w:proofErr w:type="spellStart"/>
+      <w:r>
+        <w:rPr>
+          <w:lang w:val="en-US"/>
+        </w:rPr>
+        <w:t>best_rpm</w:t>
+      </w:r>
+      <w:proofErr w:type="spellEnd"/>
+      <w:r>
+        <w:rPr>
+          <w:lang w:val="en-US"/>
+        </w:rPr>
+        <w:t xml:space="preserve"> = rpm;</w:t>
+      </w:r>
+    </w:p>
+    <w:p>
+      <w:pPr>
+        <w:ind w:firstLine="0"/>
+        <w:rPr>
+          <w:lang w:val="en-US"/>
+        </w:rPr>
+      </w:pPr>
+      <w:r>
+        <w:rPr>
+          <w:lang w:val="en-US"/>
+        </w:rPr>
+        <w:t xml:space="preserve">                </w:t>
+      </w:r>
+      <w:proofErr w:type="spellStart"/>
+      <w:r>
+        <w:rPr>
+          <w:lang w:val="en-US"/>
+        </w:rPr>
+        <w:t>best_T_eng</w:t>
+      </w:r>
+      <w:proofErr w:type="spellEnd"/>
+      <w:r>
+        <w:rPr>
+          <w:lang w:val="en-US"/>
+        </w:rPr>
+        <w:t xml:space="preserve"> = </w:t>
+      </w:r>
+      <w:proofErr w:type="spellStart"/>
+      <w:r>
+        <w:rPr>
+          <w:lang w:val="en-US"/>
+        </w:rPr>
+        <w:t>T_ice</w:t>
       </w:r>
       <w:proofErr w:type="spellEnd"/>
       <w:r>
@@ -22635,42 +22884,6 @@
         <w:rPr>
           <w:lang w:val="en-US"/>
         </w:rPr>
-        <w:t xml:space="preserve">            </w:t>
-      </w:r>
-    </w:p>
-    <w:p>
-      <w:pPr>
-        <w:ind w:firstLine="0"/>
-        <w:rPr>
-          <w:lang w:val="en-US"/>
-        </w:rPr>
-      </w:pPr>
-      <w:r>
-        <w:rPr>
-          <w:lang w:val="en-US"/>
-        </w:rPr>
-        <w:t xml:space="preserve">            if J &lt; </w:t>
-      </w:r>
-      <w:proofErr w:type="spellStart"/>
-      <w:r>
-        <w:rPr>
-          <w:lang w:val="en-US"/>
-        </w:rPr>
-        <w:t>best_J</w:t>
-      </w:r>
-      <w:proofErr w:type="spellEnd"/>
-    </w:p>
-    <w:p>
-      <w:pPr>
-        <w:ind w:firstLine="0"/>
-        <w:rPr>
-          <w:lang w:val="en-US"/>
-        </w:rPr>
-      </w:pPr>
-      <w:r>
-        <w:rPr>
-          <w:lang w:val="en-US"/>
-        </w:rPr>
         <w:t xml:space="preserve">                </w:t>
       </w:r>
       <w:proofErr w:type="spellStart"/>
@@ -22678,104 +22891,6 @@
         <w:rPr>
           <w:lang w:val="en-US"/>
         </w:rPr>
-        <w:t>best_J</w:t>
-      </w:r>
-      <w:proofErr w:type="spellEnd"/>
-      <w:r>
-        <w:rPr>
-          <w:lang w:val="en-US"/>
-        </w:rPr>
-        <w:t xml:space="preserve"> = J;</w:t>
-      </w:r>
-    </w:p>
-    <w:p>
-      <w:pPr>
-        <w:ind w:firstLine="0"/>
-        <w:rPr>
-          <w:lang w:val="en-US"/>
-        </w:rPr>
-      </w:pPr>
-      <w:r>
-        <w:rPr>
-          <w:lang w:val="en-US"/>
-        </w:rPr>
-        <w:t xml:space="preserve">                </w:t>
-      </w:r>
-      <w:proofErr w:type="spellStart"/>
-      <w:r>
-        <w:rPr>
-          <w:lang w:val="en-US"/>
-        </w:rPr>
-        <w:t>best_rpm</w:t>
-      </w:r>
-      <w:proofErr w:type="spellEnd"/>
-      <w:r>
-        <w:rPr>
-          <w:lang w:val="en-US"/>
-        </w:rPr>
-        <w:t xml:space="preserve"> = rpm;</w:t>
-      </w:r>
-    </w:p>
-    <w:p>
-      <w:pPr>
-        <w:ind w:firstLine="0"/>
-        <w:rPr>
-          <w:lang w:val="en-US"/>
-        </w:rPr>
-      </w:pPr>
-      <w:r>
-        <w:rPr>
-          <w:lang w:val="en-US"/>
-        </w:rPr>
-        <w:t xml:space="preserve">                </w:t>
-      </w:r>
-      <w:proofErr w:type="spellStart"/>
-      <w:r>
-        <w:rPr>
-          <w:lang w:val="en-US"/>
-        </w:rPr>
-        <w:t>best_T_eng</w:t>
-      </w:r>
-      <w:proofErr w:type="spellEnd"/>
-      <w:r>
-        <w:rPr>
-          <w:lang w:val="en-US"/>
-        </w:rPr>
-        <w:t xml:space="preserve"> = </w:t>
-      </w:r>
-      <w:proofErr w:type="spellStart"/>
-      <w:r>
-        <w:rPr>
-          <w:lang w:val="en-US"/>
-        </w:rPr>
-        <w:t>T_ice</w:t>
-      </w:r>
-      <w:proofErr w:type="spellEnd"/>
-      <w:r>
-        <w:rPr>
-          <w:lang w:val="en-US"/>
-        </w:rPr>
-        <w:t>;</w:t>
-      </w:r>
-    </w:p>
-    <w:p>
-      <w:pPr>
-        <w:ind w:firstLine="0"/>
-        <w:rPr>
-          <w:lang w:val="en-US"/>
-        </w:rPr>
-      </w:pPr>
-      <w:r>
-        <w:rPr>
-          <w:lang w:val="en-US"/>
-        </w:rPr>
-        <w:t xml:space="preserve">                </w:t>
-      </w:r>
-      <w:proofErr w:type="spellStart"/>
-      <w:r>
-        <w:rPr>
-          <w:lang w:val="en-US"/>
-        </w:rPr>
         <w:t>best_T_mg</w:t>
       </w:r>
       <w:proofErr w:type="spellEnd"/>
@@ -22783,21 +22898,7 @@
         <w:rPr>
           <w:lang w:val="en-US"/>
         </w:rPr>
-        <w:t xml:space="preserve"> = </w:t>
-      </w:r>
-      <w:proofErr w:type="spellStart"/>
-      <w:r>
-        <w:rPr>
-          <w:lang w:val="en-US"/>
-        </w:rPr>
-        <w:t>T_mg</w:t>
-      </w:r>
-      <w:proofErr w:type="spellEnd"/>
-      <w:r>
-        <w:rPr>
-          <w:lang w:val="en-US"/>
-        </w:rPr>
-        <w:t>;</w:t>
+        <w:t xml:space="preserve"> = T_mg;</w:t>
       </w:r>
     </w:p>
     <w:p>
@@ -25599,6 +25700,9 @@
     <w:p>
       <w:pPr>
         <w:ind w:firstLine="0"/>
+        <w:rPr>
+          <w:lang w:val="en-US"/>
+        </w:rPr>
       </w:pPr>
       <w:r>
         <w:rPr>
@@ -25607,6 +25711,9 @@
         <w:t>hold</w:t>
       </w:r>
       <w:r>
+        <w:rPr>
+          <w:lang w:val="en-US"/>
+        </w:rPr>
         <w:t xml:space="preserve"> </w:t>
       </w:r>
       <w:r>
@@ -25616,12 +25723,18 @@
         <w:t>on</w:t>
       </w:r>
       <w:r>
+        <w:rPr>
+          <w:lang w:val="en-US"/>
+        </w:rPr>
         <w:t>;</w:t>
       </w:r>
     </w:p>
     <w:p>
       <w:pPr>
         <w:ind w:firstLine="0"/>
+        <w:rPr>
+          <w:lang w:val="en-US"/>
+        </w:rPr>
       </w:pPr>
     </w:p>
     <w:p>
@@ -27933,11 +28046,17 @@
     <w:p>
       <w:pPr>
         <w:ind w:firstLine="0"/>
+        <w:rPr>
+          <w:lang w:val="en-US"/>
+        </w:rPr>
       </w:pPr>
       <w:r>
         <w:t xml:space="preserve">    </w:t>
       </w:r>
       <w:r>
+        <w:rPr>
+          <w:lang w:val="en-US"/>
+        </w:rPr>
         <w:t xml:space="preserve">% </w:t>
       </w:r>
       <w:r>
@@ -27952,6 +28071,9 @@
         </w:rPr>
       </w:pPr>
       <w:r>
+        <w:rPr>
+          <w:lang w:val="en-US"/>
+        </w:rPr>
         <w:t xml:space="preserve">    </w:t>
       </w:r>
       <w:proofErr w:type="spellStart"/>
@@ -28297,9 +28419,6 @@
     <w:p>
       <w:pPr>
         <w:ind w:firstLine="0"/>
-        <w:rPr>
-          <w:lang w:val="en-US"/>
-        </w:rPr>
       </w:pPr>
       <w:r>
         <w:rPr>
@@ -28311,9 +28430,6 @@
     <w:p>
       <w:pPr>
         <w:ind w:firstLine="0"/>
-        <w:rPr>
-          <w:lang w:val="en-US"/>
-        </w:rPr>
       </w:pPr>
     </w:p>
     <w:p>

</xml_diff>